<commit_message>
Fix OR-list scoring bug + add real payment/support system experience
Corrected a methodology mistake: "SaaS, Enterprise Applications, or Digital
Products" is one JD requirement satisfied by any alternative, not three
separate must-haves. Splitting it into 3 keywords wrongly penalized an
already-honest match. Collapsed to the one alternative actually true
(Digital Products) before scoring.

Also added real detail Kshitiz provided: an omnichannel customer-support
helpdesk (LMS/email/WhatsApp-bot/platform-bot) and expanded payment API
integration (create + verify status), both now in experience_bank.md and
swapped into the Velocitai Digital resume in place of the less-relevant
prototyping bullet.

Honest re-score: 85% -> 94% (17/18 keywords, corrected list). Only genuine
remaining gap is Azure DevOps, which Kshitiz confirmed he doesn't have --
left unclaimed. Documented the OR-list gotcha in CLAUDE.md so it isn't
repeated.

Co-Authored-By: Claude Sonnet 5 <noreply@anthropic.com>
</commit_message>
<xml_diff>
--- a/resumes/Velocitai Digital-Product Manager.docx
+++ b/resumes/Velocitai Digital-Product Manager.docx
@@ -258,7 +258,7 @@
           <w:color w:val="2E5AAC"/>
           <w:sz w:val="19"/>
         </w:rPr>
-        <w:t>AI, Design &amp; Automation</w:t>
+        <w:t>Support Systems, Payments &amp; Automation</w:t>
       </w:r>
     </w:p>
     <w:p>
@@ -273,7 +273,7 @@
           <w:i w:val="0"/>
           <w:sz w:val="19"/>
         </w:rPr>
-        <w:t>Designed prototypes and MVP interfaces for the app, LMS, and CRM in Figma, Adobe Express, and Canva AI -- using Gemini, Claude, ChatGPT, and Codex to accelerate iteration into clickable flows that aligned engineering and stakeholders before build.</w:t>
+        <w:t>Built a unified, omnichannel customer-support helpdesk consolidating issues raised across LMS, email, WhatsApp chatbot, and in-platform chatbot channels into one system; API-integrated multiple payment gateways handling both payment creation and status verification.</w:t>
       </w:r>
     </w:p>
     <w:p>
@@ -288,7 +288,7 @@
           <w:i w:val="0"/>
           <w:sz w:val="19"/>
         </w:rPr>
-        <w:t>Shipped a production GenAI layer (speech/text learning with contextual, age-appropriate responses) and a support chatbot that cut escalations; revamped the Sales CRM (lead navigation, integrated calling, revenue tracking, target-vs-achievement, incentive management), cutting sales-ops workload 80%.</w:t>
+        <w:t>Shipped a production GenAI layer (speech/text learning with contextual, age-appropriate responses); revamped the Sales CRM (lead navigation, integrated calling, revenue tracking, target-vs-achievement, incentive management), cutting sales-ops workload 80%.</w:t>
       </w:r>
     </w:p>
     <w:p>

</xml_diff>